<commit_message>
Adição de prints para evidências documentais
</commit_message>
<xml_diff>
--- a/documentacao/ProjetoEmGrupoPOOESPm - API - Gamification Case_v2.docx
+++ b/documentacao/ProjetoEmGrupoPOOESPm - API - Gamification Case_v2.docx
@@ -336,7 +336,6 @@
           <w:numId w:val="7"/>
         </w:numPr>
       </w:pPr>
-      <w:bookmarkStart w:id="0" w:name="_GoBack"/>
       <w:r>
         <w:t>A partir do estudo de caso-desafio (supramencionado), defina uma funcionalidade. A partir disso, faça:</w:t>
       </w:r>
@@ -357,6 +356,10 @@
       <w:pPr>
         <w:pStyle w:val="PargrafodaLista"/>
         <w:jc w:val="both"/>
+        <w:rPr>
+          <w:i/>
+          <w:color w:val="747474" w:themeColor="background2" w:themeShade="80"/>
+        </w:rPr>
       </w:pPr>
       <w:r>
         <w:rPr>
@@ -555,6 +558,87 @@
           <w:color w:val="747474" w:themeColor="background2" w:themeShade="80"/>
         </w:rPr>
         <w:t>cios.</w:t>
+      </w:r>
+    </w:p>
+    <w:p>
+      <w:pPr>
+        <w:pStyle w:val="PargrafodaLista"/>
+        <w:jc w:val="both"/>
+      </w:pPr>
+      <w:r>
+        <w:lastRenderedPageBreak/>
+        <w:drawing>
+          <wp:inline distT="0" distB="0" distL="0" distR="0" wp14:anchorId="72801818" wp14:editId="1646591E">
+            <wp:extent cx="1381108" cy="2324100"/>
+            <wp:effectExtent l="0" t="0" r="0" b="0"/>
+            <wp:docPr id="1" name="Imagem 1"/>
+            <wp:cNvGraphicFramePr>
+              <a:graphicFrameLocks xmlns:a="http://schemas.openxmlformats.org/drawingml/2006/main" noChangeAspect="1"/>
+            </wp:cNvGraphicFramePr>
+            <a:graphic xmlns:a="http://schemas.openxmlformats.org/drawingml/2006/main">
+              <a:graphicData uri="http://schemas.openxmlformats.org/drawingml/2006/picture">
+                <pic:pic xmlns:pic="http://schemas.openxmlformats.org/drawingml/2006/picture">
+                  <pic:nvPicPr>
+                    <pic:cNvPr id="1" name=""/>
+                    <pic:cNvPicPr/>
+                  </pic:nvPicPr>
+                  <pic:blipFill>
+                    <a:blip r:embed="rId7"/>
+                    <a:stretch>
+                      <a:fillRect/>
+                    </a:stretch>
+                  </pic:blipFill>
+                  <pic:spPr>
+                    <a:xfrm>
+                      <a:off x="0" y="0"/>
+                      <a:ext cx="1399069" cy="2354324"/>
+                    </a:xfrm>
+                    <a:prstGeom prst="rect">
+                      <a:avLst/>
+                    </a:prstGeom>
+                  </pic:spPr>
+                </pic:pic>
+              </a:graphicData>
+            </a:graphic>
+          </wp:inline>
+        </w:drawing>
+      </w:r>
+      <w:r>
+        <w:drawing>
+          <wp:inline distT="0" distB="0" distL="0" distR="0" wp14:anchorId="34E617F9" wp14:editId="0AA5606D">
+            <wp:extent cx="1381108" cy="2324100"/>
+            <wp:effectExtent l="0" t="0" r="0" b="0"/>
+            <wp:docPr id="2" name="Imagem 2"/>
+            <wp:cNvGraphicFramePr>
+              <a:graphicFrameLocks xmlns:a="http://schemas.openxmlformats.org/drawingml/2006/main" noChangeAspect="1"/>
+            </wp:cNvGraphicFramePr>
+            <a:graphic xmlns:a="http://schemas.openxmlformats.org/drawingml/2006/main">
+              <a:graphicData uri="http://schemas.openxmlformats.org/drawingml/2006/picture">
+                <pic:pic xmlns:pic="http://schemas.openxmlformats.org/drawingml/2006/picture">
+                  <pic:nvPicPr>
+                    <pic:cNvPr id="1" name=""/>
+                    <pic:cNvPicPr/>
+                  </pic:nvPicPr>
+                  <pic:blipFill>
+                    <a:blip r:embed="rId7"/>
+                    <a:stretch>
+                      <a:fillRect/>
+                    </a:stretch>
+                  </pic:blipFill>
+                  <pic:spPr>
+                    <a:xfrm>
+                      <a:off x="0" y="0"/>
+                      <a:ext cx="1392368" cy="2343048"/>
+                    </a:xfrm>
+                    <a:prstGeom prst="rect">
+                      <a:avLst/>
+                    </a:prstGeom>
+                  </pic:spPr>
+                </pic:pic>
+              </a:graphicData>
+            </a:graphic>
+          </wp:inline>
+        </w:drawing>
       </w:r>
     </w:p>
     <w:p>
@@ -957,7 +1041,6 @@
           <w:i/>
           <w:color w:val="747474" w:themeColor="background2" w:themeShade="80"/>
         </w:rPr>
-        <w:lastRenderedPageBreak/>
         <w:t>V</w:t>
       </w:r>
       <w:r>
@@ -1306,23 +1389,7 @@
           <w:i/>
           <w:color w:val="747474" w:themeColor="background2" w:themeShade="80"/>
         </w:rPr>
-        <w:t xml:space="preserve"> = professor)` para cursos, enquanto `Curso.java` possui `@</w:t>
-      </w:r>
-      <w:proofErr w:type="spellStart"/>
-      <w:r>
-        <w:rPr>
-          <w:i/>
-          <w:color w:val="747474" w:themeColor="background2" w:themeShade="80"/>
-        </w:rPr>
-        <w:t>ManyToOne</w:t>
-      </w:r>
-      <w:proofErr w:type="spellEnd"/>
-      <w:r>
-        <w:rPr>
-          <w:i/>
-          <w:color w:val="747474" w:themeColor="background2" w:themeShade="80"/>
-        </w:rPr>
-        <w:t xml:space="preserve">` para professor. </w:t>
+        <w:t xml:space="preserve"> = professor)` para cursos</w:t>
       </w:r>
     </w:p>
     <w:p>
@@ -1339,41 +1406,41 @@
           <w:i/>
           <w:color w:val="747474" w:themeColor="background2" w:themeShade="80"/>
         </w:rPr>
-        <w:t>`Aluno.java` possui `@</w:t>
-      </w:r>
-      <w:proofErr w:type="spellStart"/>
-      <w:proofErr w:type="gramStart"/>
-      <w:r>
-        <w:rPr>
-          <w:i/>
-          <w:color w:val="747474" w:themeColor="background2" w:themeShade="80"/>
-        </w:rPr>
-        <w:t>OneToMany</w:t>
-      </w:r>
-      <w:proofErr w:type="spellEnd"/>
-      <w:r>
-        <w:rPr>
-          <w:i/>
-          <w:color w:val="747474" w:themeColor="background2" w:themeShade="80"/>
-        </w:rPr>
-        <w:t>(</w:t>
-      </w:r>
-      <w:proofErr w:type="spellStart"/>
-      <w:proofErr w:type="gramEnd"/>
-      <w:r>
-        <w:rPr>
-          <w:i/>
-          <w:color w:val="747474" w:themeColor="background2" w:themeShade="80"/>
-        </w:rPr>
-        <w:t>mappedBy</w:t>
-      </w:r>
-      <w:proofErr w:type="spellEnd"/>
-      <w:r>
-        <w:rPr>
-          <w:i/>
-          <w:color w:val="747474" w:themeColor="background2" w:themeShade="80"/>
-        </w:rPr>
-        <w:t xml:space="preserve"> = aluno)` para matriculas; </w:t>
+        <w:drawing>
+          <wp:inline distT="0" distB="0" distL="0" distR="0" wp14:anchorId="16175C26" wp14:editId="15831848">
+            <wp:extent cx="1885950" cy="993317"/>
+            <wp:effectExtent l="0" t="0" r="0" b="0"/>
+            <wp:docPr id="3" name="Imagem 3"/>
+            <wp:cNvGraphicFramePr>
+              <a:graphicFrameLocks xmlns:a="http://schemas.openxmlformats.org/drawingml/2006/main" noChangeAspect="1"/>
+            </wp:cNvGraphicFramePr>
+            <a:graphic xmlns:a="http://schemas.openxmlformats.org/drawingml/2006/main">
+              <a:graphicData uri="http://schemas.openxmlformats.org/drawingml/2006/picture">
+                <pic:pic xmlns:pic="http://schemas.openxmlformats.org/drawingml/2006/picture">
+                  <pic:nvPicPr>
+                    <pic:cNvPr id="1" name=""/>
+                    <pic:cNvPicPr/>
+                  </pic:nvPicPr>
+                  <pic:blipFill>
+                    <a:blip r:embed="rId8"/>
+                    <a:stretch>
+                      <a:fillRect/>
+                    </a:stretch>
+                  </pic:blipFill>
+                  <pic:spPr>
+                    <a:xfrm>
+                      <a:off x="0" y="0"/>
+                      <a:ext cx="1913749" cy="1007959"/>
+                    </a:xfrm>
+                    <a:prstGeom prst="rect">
+                      <a:avLst/>
+                    </a:prstGeom>
+                  </pic:spPr>
+                </pic:pic>
+              </a:graphicData>
+            </a:graphic>
+          </wp:inline>
+        </w:drawing>
       </w:r>
     </w:p>
     <w:p>
@@ -1390,6 +1457,193 @@
           <w:i/>
           <w:color w:val="747474" w:themeColor="background2" w:themeShade="80"/>
         </w:rPr>
+        <w:t xml:space="preserve"> `Curso.java` possui `@</w:t>
+      </w:r>
+      <w:proofErr w:type="spellStart"/>
+      <w:r>
+        <w:rPr>
+          <w:i/>
+          <w:color w:val="747474" w:themeColor="background2" w:themeShade="80"/>
+        </w:rPr>
+        <w:t>ManyToOne</w:t>
+      </w:r>
+      <w:proofErr w:type="spellEnd"/>
+      <w:r>
+        <w:rPr>
+          <w:i/>
+          <w:color w:val="747474" w:themeColor="background2" w:themeShade="80"/>
+        </w:rPr>
+        <w:t xml:space="preserve">` para professor. </w:t>
+      </w:r>
+    </w:p>
+    <w:p>
+      <w:pPr>
+        <w:pStyle w:val="PargrafodaLista"/>
+        <w:jc w:val="both"/>
+        <w:rPr>
+          <w:i/>
+          <w:color w:val="747474" w:themeColor="background2" w:themeShade="80"/>
+        </w:rPr>
+      </w:pPr>
+      <w:r>
+        <w:rPr>
+          <w:i/>
+          <w:color w:val="747474" w:themeColor="background2" w:themeShade="80"/>
+        </w:rPr>
+        <w:drawing>
+          <wp:inline distT="0" distB="0" distL="0" distR="0" wp14:anchorId="14B317A7" wp14:editId="3F279155">
+            <wp:extent cx="3746500" cy="1042359"/>
+            <wp:effectExtent l="0" t="0" r="6350" b="5715"/>
+            <wp:docPr id="4" name="Imagem 4"/>
+            <wp:cNvGraphicFramePr>
+              <a:graphicFrameLocks xmlns:a="http://schemas.openxmlformats.org/drawingml/2006/main" noChangeAspect="1"/>
+            </wp:cNvGraphicFramePr>
+            <a:graphic xmlns:a="http://schemas.openxmlformats.org/drawingml/2006/main">
+              <a:graphicData uri="http://schemas.openxmlformats.org/drawingml/2006/picture">
+                <pic:pic xmlns:pic="http://schemas.openxmlformats.org/drawingml/2006/picture">
+                  <pic:nvPicPr>
+                    <pic:cNvPr id="1" name=""/>
+                    <pic:cNvPicPr/>
+                  </pic:nvPicPr>
+                  <pic:blipFill>
+                    <a:blip r:embed="rId9"/>
+                    <a:stretch>
+                      <a:fillRect/>
+                    </a:stretch>
+                  </pic:blipFill>
+                  <pic:spPr>
+                    <a:xfrm>
+                      <a:off x="0" y="0"/>
+                      <a:ext cx="3787804" cy="1053851"/>
+                    </a:xfrm>
+                    <a:prstGeom prst="rect">
+                      <a:avLst/>
+                    </a:prstGeom>
+                  </pic:spPr>
+                </pic:pic>
+              </a:graphicData>
+            </a:graphic>
+          </wp:inline>
+        </w:drawing>
+      </w:r>
+    </w:p>
+    <w:p>
+      <w:pPr>
+        <w:pStyle w:val="PargrafodaLista"/>
+        <w:jc w:val="both"/>
+        <w:rPr>
+          <w:i/>
+          <w:color w:val="747474" w:themeColor="background2" w:themeShade="80"/>
+        </w:rPr>
+      </w:pPr>
+      <w:r>
+        <w:rPr>
+          <w:i/>
+          <w:color w:val="747474" w:themeColor="background2" w:themeShade="80"/>
+        </w:rPr>
+        <w:t>`Aluno.java` possui `@</w:t>
+      </w:r>
+      <w:proofErr w:type="spellStart"/>
+      <w:proofErr w:type="gramStart"/>
+      <w:r>
+        <w:rPr>
+          <w:i/>
+          <w:color w:val="747474" w:themeColor="background2" w:themeShade="80"/>
+        </w:rPr>
+        <w:t>OneToMany</w:t>
+      </w:r>
+      <w:proofErr w:type="spellEnd"/>
+      <w:r>
+        <w:rPr>
+          <w:i/>
+          <w:color w:val="747474" w:themeColor="background2" w:themeShade="80"/>
+        </w:rPr>
+        <w:t>(</w:t>
+      </w:r>
+      <w:proofErr w:type="spellStart"/>
+      <w:proofErr w:type="gramEnd"/>
+      <w:r>
+        <w:rPr>
+          <w:i/>
+          <w:color w:val="747474" w:themeColor="background2" w:themeShade="80"/>
+        </w:rPr>
+        <w:t>mappedBy</w:t>
+      </w:r>
+      <w:proofErr w:type="spellEnd"/>
+      <w:r>
+        <w:rPr>
+          <w:i/>
+          <w:color w:val="747474" w:themeColor="background2" w:themeShade="80"/>
+        </w:rPr>
+        <w:t xml:space="preserve"> = aluno)` para matriculas; </w:t>
+      </w:r>
+    </w:p>
+    <w:p>
+      <w:pPr>
+        <w:pStyle w:val="PargrafodaLista"/>
+        <w:jc w:val="both"/>
+        <w:rPr>
+          <w:i/>
+          <w:color w:val="747474" w:themeColor="background2" w:themeShade="80"/>
+        </w:rPr>
+      </w:pPr>
+      <w:r>
+        <w:rPr>
+          <w:i/>
+          <w:color w:val="747474" w:themeColor="background2" w:themeShade="80"/>
+        </w:rPr>
+        <w:drawing>
+          <wp:inline distT="0" distB="0" distL="0" distR="0" wp14:anchorId="349D26A6" wp14:editId="1F06BAE4">
+            <wp:extent cx="3670300" cy="509284"/>
+            <wp:effectExtent l="0" t="0" r="6350" b="5080"/>
+            <wp:docPr id="5" name="Imagem 5"/>
+            <wp:cNvGraphicFramePr>
+              <a:graphicFrameLocks xmlns:a="http://schemas.openxmlformats.org/drawingml/2006/main" noChangeAspect="1"/>
+            </wp:cNvGraphicFramePr>
+            <a:graphic xmlns:a="http://schemas.openxmlformats.org/drawingml/2006/main">
+              <a:graphicData uri="http://schemas.openxmlformats.org/drawingml/2006/picture">
+                <pic:pic xmlns:pic="http://schemas.openxmlformats.org/drawingml/2006/picture">
+                  <pic:nvPicPr>
+                    <pic:cNvPr id="1" name=""/>
+                    <pic:cNvPicPr/>
+                  </pic:nvPicPr>
+                  <pic:blipFill>
+                    <a:blip r:embed="rId10"/>
+                    <a:stretch>
+                      <a:fillRect/>
+                    </a:stretch>
+                  </pic:blipFill>
+                  <pic:spPr>
+                    <a:xfrm>
+                      <a:off x="0" y="0"/>
+                      <a:ext cx="3777583" cy="524170"/>
+                    </a:xfrm>
+                    <a:prstGeom prst="rect">
+                      <a:avLst/>
+                    </a:prstGeom>
+                  </pic:spPr>
+                </pic:pic>
+              </a:graphicData>
+            </a:graphic>
+          </wp:inline>
+        </w:drawing>
+      </w:r>
+    </w:p>
+    <w:p>
+      <w:pPr>
+        <w:pStyle w:val="PargrafodaLista"/>
+        <w:jc w:val="both"/>
+        <w:rPr>
+          <w:i/>
+          <w:color w:val="747474" w:themeColor="background2" w:themeShade="80"/>
+        </w:rPr>
+      </w:pPr>
+      <w:r>
+        <w:rPr>
+          <w:i/>
+          <w:color w:val="747474" w:themeColor="background2" w:themeShade="80"/>
+        </w:rPr>
+        <w:lastRenderedPageBreak/>
         <w:t>`Matricula.java` possui `@</w:t>
       </w:r>
       <w:proofErr w:type="spellStart"/>
@@ -1408,6 +1662,67 @@
         </w:rPr>
         <w:t>` para `Aluno` e `Curso`, formando o relacionamento entre aluno e curso.</w:t>
       </w:r>
+    </w:p>
+    <w:p>
+      <w:pPr>
+        <w:pStyle w:val="PargrafodaLista"/>
+        <w:jc w:val="both"/>
+        <w:rPr>
+          <w:i/>
+          <w:color w:val="747474" w:themeColor="background2" w:themeShade="80"/>
+        </w:rPr>
+      </w:pPr>
+      <w:r>
+        <w:rPr>
+          <w:i/>
+          <w:color w:val="747474" w:themeColor="background2" w:themeShade="80"/>
+        </w:rPr>
+        <w:drawing>
+          <wp:inline distT="0" distB="0" distL="0" distR="0" wp14:anchorId="17402B17" wp14:editId="2613EB1B">
+            <wp:extent cx="3073400" cy="1419966"/>
+            <wp:effectExtent l="0" t="0" r="0" b="8890"/>
+            <wp:docPr id="6" name="Imagem 6"/>
+            <wp:cNvGraphicFramePr>
+              <a:graphicFrameLocks xmlns:a="http://schemas.openxmlformats.org/drawingml/2006/main" noChangeAspect="1"/>
+            </wp:cNvGraphicFramePr>
+            <a:graphic xmlns:a="http://schemas.openxmlformats.org/drawingml/2006/main">
+              <a:graphicData uri="http://schemas.openxmlformats.org/drawingml/2006/picture">
+                <pic:pic xmlns:pic="http://schemas.openxmlformats.org/drawingml/2006/picture">
+                  <pic:nvPicPr>
+                    <pic:cNvPr id="1" name=""/>
+                    <pic:cNvPicPr/>
+                  </pic:nvPicPr>
+                  <pic:blipFill>
+                    <a:blip r:embed="rId11"/>
+                    <a:stretch>
+                      <a:fillRect/>
+                    </a:stretch>
+                  </pic:blipFill>
+                  <pic:spPr>
+                    <a:xfrm>
+                      <a:off x="0" y="0"/>
+                      <a:ext cx="3089905" cy="1427592"/>
+                    </a:xfrm>
+                    <a:prstGeom prst="rect">
+                      <a:avLst/>
+                    </a:prstGeom>
+                  </pic:spPr>
+                </pic:pic>
+              </a:graphicData>
+            </a:graphic>
+          </wp:inline>
+        </w:drawing>
+      </w:r>
+    </w:p>
+    <w:p>
+      <w:pPr>
+        <w:pStyle w:val="PargrafodaLista"/>
+        <w:jc w:val="both"/>
+        <w:rPr>
+          <w:i/>
+          <w:color w:val="747474" w:themeColor="background2" w:themeShade="80"/>
+        </w:rPr>
+      </w:pPr>
     </w:p>
     <w:p>
       <w:pPr>
@@ -1798,6 +2113,141 @@
     <w:p>
       <w:pPr>
         <w:pStyle w:val="PargrafodaLista"/>
+        <w:jc w:val="both"/>
+        <w:rPr>
+          <w:i/>
+          <w:color w:val="747474" w:themeColor="background2" w:themeShade="80"/>
+        </w:rPr>
+      </w:pPr>
+      <w:r>
+        <w:rPr>
+          <w:i/>
+          <w:color w:val="747474" w:themeColor="background2" w:themeShade="80"/>
+        </w:rPr>
+        <w:drawing>
+          <wp:inline distT="0" distB="0" distL="0" distR="0" wp14:anchorId="1CC68D62" wp14:editId="4ADDC114">
+            <wp:extent cx="2696243" cy="2946400"/>
+            <wp:effectExtent l="0" t="0" r="8890" b="6350"/>
+            <wp:docPr id="9" name="Imagem 9"/>
+            <wp:cNvGraphicFramePr>
+              <a:graphicFrameLocks xmlns:a="http://schemas.openxmlformats.org/drawingml/2006/main" noChangeAspect="1"/>
+            </wp:cNvGraphicFramePr>
+            <a:graphic xmlns:a="http://schemas.openxmlformats.org/drawingml/2006/main">
+              <a:graphicData uri="http://schemas.openxmlformats.org/drawingml/2006/picture">
+                <pic:pic xmlns:pic="http://schemas.openxmlformats.org/drawingml/2006/picture">
+                  <pic:nvPicPr>
+                    <pic:cNvPr id="1" name=""/>
+                    <pic:cNvPicPr/>
+                  </pic:nvPicPr>
+                  <pic:blipFill>
+                    <a:blip r:embed="rId12"/>
+                    <a:stretch>
+                      <a:fillRect/>
+                    </a:stretch>
+                  </pic:blipFill>
+                  <pic:spPr>
+                    <a:xfrm>
+                      <a:off x="0" y="0"/>
+                      <a:ext cx="2699291" cy="2949731"/>
+                    </a:xfrm>
+                    <a:prstGeom prst="rect">
+                      <a:avLst/>
+                    </a:prstGeom>
+                  </pic:spPr>
+                </pic:pic>
+              </a:graphicData>
+            </a:graphic>
+          </wp:inline>
+        </w:drawing>
+      </w:r>
+    </w:p>
+    <w:p>
+      <w:pPr>
+        <w:pStyle w:val="PargrafodaLista"/>
+        <w:jc w:val="both"/>
+        <w:rPr>
+          <w:i/>
+          <w:color w:val="747474" w:themeColor="background2" w:themeShade="80"/>
+        </w:rPr>
+      </w:pPr>
+      <w:r>
+        <w:rPr>
+          <w:i/>
+          <w:color w:val="747474" w:themeColor="background2" w:themeShade="80"/>
+        </w:rPr>
+        <w:t xml:space="preserve">Não foi adicionado o código completo do </w:t>
+      </w:r>
+      <w:proofErr w:type="spellStart"/>
+      <w:r>
+        <w:rPr>
+          <w:i/>
+          <w:color w:val="747474" w:themeColor="background2" w:themeShade="80"/>
+        </w:rPr>
+        <w:t>pom</w:t>
+      </w:r>
+      <w:proofErr w:type="spellEnd"/>
+      <w:r>
+        <w:rPr>
+          <w:i/>
+          <w:color w:val="747474" w:themeColor="background2" w:themeShade="80"/>
+        </w:rPr>
+        <w:t xml:space="preserve"> para não ficar muito extenso</w:t>
+      </w:r>
+    </w:p>
+    <w:p>
+      <w:pPr>
+        <w:pStyle w:val="PargrafodaLista"/>
+        <w:jc w:val="both"/>
+        <w:rPr>
+          <w:i/>
+          <w:color w:val="747474" w:themeColor="background2" w:themeShade="80"/>
+        </w:rPr>
+      </w:pPr>
+      <w:r>
+        <w:rPr>
+          <w:i/>
+          <w:color w:val="747474" w:themeColor="background2" w:themeShade="80"/>
+        </w:rPr>
+        <w:drawing>
+          <wp:inline distT="0" distB="0" distL="0" distR="0" wp14:anchorId="62F1B02D" wp14:editId="6D00AA94">
+            <wp:extent cx="3772426" cy="1457528"/>
+            <wp:effectExtent l="0" t="0" r="0" b="9525"/>
+            <wp:docPr id="8" name="Imagem 8"/>
+            <wp:cNvGraphicFramePr>
+              <a:graphicFrameLocks xmlns:a="http://schemas.openxmlformats.org/drawingml/2006/main" noChangeAspect="1"/>
+            </wp:cNvGraphicFramePr>
+            <a:graphic xmlns:a="http://schemas.openxmlformats.org/drawingml/2006/main">
+              <a:graphicData uri="http://schemas.openxmlformats.org/drawingml/2006/picture">
+                <pic:pic xmlns:pic="http://schemas.openxmlformats.org/drawingml/2006/picture">
+                  <pic:nvPicPr>
+                    <pic:cNvPr id="1" name=""/>
+                    <pic:cNvPicPr/>
+                  </pic:nvPicPr>
+                  <pic:blipFill>
+                    <a:blip r:embed="rId13"/>
+                    <a:stretch>
+                      <a:fillRect/>
+                    </a:stretch>
+                  </pic:blipFill>
+                  <pic:spPr>
+                    <a:xfrm>
+                      <a:off x="0" y="0"/>
+                      <a:ext cx="3772426" cy="1457528"/>
+                    </a:xfrm>
+                    <a:prstGeom prst="rect">
+                      <a:avLst/>
+                    </a:prstGeom>
+                  </pic:spPr>
+                </pic:pic>
+              </a:graphicData>
+            </a:graphic>
+          </wp:inline>
+        </w:drawing>
+      </w:r>
+    </w:p>
+    <w:p>
+      <w:pPr>
+        <w:pStyle w:val="PargrafodaLista"/>
       </w:pPr>
     </w:p>
     <w:p>
@@ -1809,6 +2259,7 @@
         </w:numPr>
       </w:pPr>
       <w:r>
+        <w:lastRenderedPageBreak/>
         <w:t xml:space="preserve">No projeto e de acordo com os princípios de Clean </w:t>
       </w:r>
       <w:proofErr w:type="spellStart"/>
@@ -2343,6 +2794,57 @@
           <w:color w:val="747474" w:themeColor="background2" w:themeShade="80"/>
         </w:rPr>
         <w:t>es.</w:t>
+      </w:r>
+    </w:p>
+    <w:p>
+      <w:pPr>
+        <w:pStyle w:val="PargrafodaLista"/>
+        <w:jc w:val="both"/>
+        <w:rPr>
+          <w:i/>
+          <w:color w:val="747474" w:themeColor="background2" w:themeShade="80"/>
+        </w:rPr>
+      </w:pPr>
+      <w:r>
+        <w:rPr>
+          <w:i/>
+          <w:color w:val="747474" w:themeColor="background2" w:themeShade="80"/>
+        </w:rPr>
+        <w:drawing>
+          <wp:inline distT="0" distB="0" distL="0" distR="0" wp14:anchorId="6CF10A0A" wp14:editId="360E11A4">
+            <wp:extent cx="1449070" cy="2070100"/>
+            <wp:effectExtent l="0" t="0" r="0" b="6350"/>
+            <wp:docPr id="10" name="Imagem 10"/>
+            <wp:cNvGraphicFramePr>
+              <a:graphicFrameLocks xmlns:a="http://schemas.openxmlformats.org/drawingml/2006/main" noChangeAspect="1"/>
+            </wp:cNvGraphicFramePr>
+            <a:graphic xmlns:a="http://schemas.openxmlformats.org/drawingml/2006/main">
+              <a:graphicData uri="http://schemas.openxmlformats.org/drawingml/2006/picture">
+                <pic:pic xmlns:pic="http://schemas.openxmlformats.org/drawingml/2006/picture">
+                  <pic:nvPicPr>
+                    <pic:cNvPr id="1" name=""/>
+                    <pic:cNvPicPr/>
+                  </pic:nvPicPr>
+                  <pic:blipFill>
+                    <a:blip r:embed="rId14"/>
+                    <a:stretch>
+                      <a:fillRect/>
+                    </a:stretch>
+                  </pic:blipFill>
+                  <pic:spPr>
+                    <a:xfrm>
+                      <a:off x="0" y="0"/>
+                      <a:ext cx="1449277" cy="2070395"/>
+                    </a:xfrm>
+                    <a:prstGeom prst="rect">
+                      <a:avLst/>
+                    </a:prstGeom>
+                  </pic:spPr>
+                </pic:pic>
+              </a:graphicData>
+            </a:graphic>
+          </wp:inline>
+        </w:drawing>
       </w:r>
     </w:p>
     <w:p>
@@ -2934,279 +3436,44 @@
     <w:p>
       <w:pPr>
         <w:pStyle w:val="PargrafodaLista"/>
-        <w:numPr>
-          <w:ilvl w:val="0"/>
-          <w:numId w:val="7"/>
-        </w:numPr>
-      </w:pPr>
-      <w:r>
-        <w:t>Inserir as Configurações no projeto para apresentação da API (</w:t>
-      </w:r>
-      <w:proofErr w:type="spellStart"/>
-      <w:r>
-        <w:t>Application</w:t>
-      </w:r>
-      <w:proofErr w:type="spellEnd"/>
-      <w:r>
-        <w:t xml:space="preserve"> </w:t>
-      </w:r>
-      <w:proofErr w:type="spellStart"/>
-      <w:r>
-        <w:t>Programming</w:t>
-      </w:r>
-      <w:proofErr w:type="spellEnd"/>
-      <w:r>
-        <w:t xml:space="preserve"> Interface) via Swagger.</w:t>
-      </w:r>
-    </w:p>
-    <w:p>
-      <w:pPr>
-        <w:pStyle w:val="PargrafodaLista"/>
-        <w:jc w:val="both"/>
-        <w:rPr>
-          <w:i/>
-          <w:color w:val="747474" w:themeColor="background2" w:themeShade="80"/>
-        </w:rPr>
-      </w:pPr>
-      <w:r>
-        <w:rPr>
-          <w:b/>
-        </w:rPr>
-        <w:t>Resposta:</w:t>
-      </w:r>
-      <w:r>
-        <w:t xml:space="preserve"> </w:t>
-      </w:r>
-      <w:r>
-        <w:rPr>
-          <w:i/>
-          <w:color w:val="747474" w:themeColor="background2" w:themeShade="80"/>
-        </w:rPr>
-        <w:t>A apresenta</w:t>
-      </w:r>
-      <w:r>
-        <w:rPr>
-          <w:i/>
-          <w:color w:val="747474" w:themeColor="background2" w:themeShade="80"/>
-        </w:rPr>
-        <w:t>çã</w:t>
-      </w:r>
-      <w:r>
-        <w:rPr>
-          <w:i/>
-          <w:color w:val="747474" w:themeColor="background2" w:themeShade="80"/>
-        </w:rPr>
-        <w:t>o da API via Swagger/</w:t>
-      </w:r>
-      <w:proofErr w:type="spellStart"/>
-      <w:r>
-        <w:rPr>
-          <w:i/>
-          <w:color w:val="747474" w:themeColor="background2" w:themeShade="80"/>
-        </w:rPr>
-        <w:t>OpenAPI</w:t>
-      </w:r>
-      <w:proofErr w:type="spellEnd"/>
-      <w:r>
-        <w:rPr>
-          <w:i/>
-          <w:color w:val="747474" w:themeColor="background2" w:themeShade="80"/>
-        </w:rPr>
-        <w:t xml:space="preserve"> est</w:t>
-      </w:r>
-      <w:r>
-        <w:rPr>
-          <w:i/>
-          <w:color w:val="747474" w:themeColor="background2" w:themeShade="80"/>
-        </w:rPr>
-        <w:t>á</w:t>
-      </w:r>
-      <w:r>
-        <w:rPr>
-          <w:i/>
-          <w:color w:val="747474" w:themeColor="background2" w:themeShade="80"/>
-        </w:rPr>
-        <w:t xml:space="preserve"> configurada pela depend</w:t>
-      </w:r>
-      <w:r>
-        <w:rPr>
-          <w:i/>
-          <w:color w:val="747474" w:themeColor="background2" w:themeShade="80"/>
-        </w:rPr>
-        <w:t>ê</w:t>
-      </w:r>
-      <w:r>
-        <w:rPr>
-          <w:i/>
-          <w:color w:val="747474" w:themeColor="background2" w:themeShade="80"/>
-        </w:rPr>
-        <w:t>ncia `</w:t>
-      </w:r>
-      <w:proofErr w:type="gramStart"/>
-      <w:r>
-        <w:rPr>
-          <w:i/>
-          <w:color w:val="747474" w:themeColor="background2" w:themeShade="80"/>
-        </w:rPr>
-        <w:t>org.springdoc</w:t>
-      </w:r>
-      <w:proofErr w:type="gramEnd"/>
-      <w:r>
-        <w:rPr>
-          <w:i/>
-          <w:color w:val="747474" w:themeColor="background2" w:themeShade="80"/>
-        </w:rPr>
-        <w:t>:springdoc-openapi-starter-webmvc-ui:2.6.0` no `pom.xml`. Em `</w:t>
-      </w:r>
-      <w:proofErr w:type="spellStart"/>
-      <w:proofErr w:type="gramStart"/>
-      <w:r>
-        <w:rPr>
-          <w:i/>
-          <w:color w:val="747474" w:themeColor="background2" w:themeShade="80"/>
-        </w:rPr>
-        <w:t>application.properties</w:t>
-      </w:r>
-      <w:proofErr w:type="spellEnd"/>
-      <w:proofErr w:type="gramEnd"/>
-      <w:r>
-        <w:rPr>
-          <w:i/>
-          <w:color w:val="747474" w:themeColor="background2" w:themeShade="80"/>
-        </w:rPr>
-        <w:t>`, a propriedade `</w:t>
-      </w:r>
-      <w:proofErr w:type="spellStart"/>
-      <w:r>
-        <w:rPr>
-          <w:i/>
-          <w:color w:val="747474" w:themeColor="background2" w:themeShade="80"/>
-        </w:rPr>
-        <w:t>springdoc.swagger-ui.path</w:t>
-      </w:r>
-      <w:proofErr w:type="spellEnd"/>
-      <w:r>
-        <w:rPr>
-          <w:i/>
-          <w:color w:val="747474" w:themeColor="background2" w:themeShade="80"/>
-        </w:rPr>
-        <w:t xml:space="preserve">=/swagger-ui.html` define o caminho da interface. Os </w:t>
-      </w:r>
-      <w:proofErr w:type="spellStart"/>
-      <w:r>
-        <w:rPr>
-          <w:i/>
-          <w:color w:val="747474" w:themeColor="background2" w:themeShade="80"/>
-        </w:rPr>
-        <w:t>controllers</w:t>
-      </w:r>
-      <w:proofErr w:type="spellEnd"/>
-      <w:r>
-        <w:rPr>
-          <w:i/>
-          <w:color w:val="747474" w:themeColor="background2" w:themeShade="80"/>
-        </w:rPr>
-        <w:t xml:space="preserve"> usam anota</w:t>
-      </w:r>
-      <w:r>
-        <w:rPr>
-          <w:i/>
-          <w:color w:val="747474" w:themeColor="background2" w:themeShade="80"/>
-        </w:rPr>
-        <w:t>çõe</w:t>
-      </w:r>
-      <w:r>
-        <w:rPr>
-          <w:i/>
-          <w:color w:val="747474" w:themeColor="background2" w:themeShade="80"/>
-        </w:rPr>
-        <w:t xml:space="preserve">s </w:t>
-      </w:r>
-      <w:proofErr w:type="spellStart"/>
-      <w:r>
-        <w:rPr>
-          <w:i/>
-          <w:color w:val="747474" w:themeColor="background2" w:themeShade="80"/>
-        </w:rPr>
-        <w:t>OpenAPI</w:t>
-      </w:r>
-      <w:proofErr w:type="spellEnd"/>
-      <w:r>
-        <w:rPr>
-          <w:i/>
-          <w:color w:val="747474" w:themeColor="background2" w:themeShade="80"/>
-        </w:rPr>
-        <w:t>, como `@</w:t>
-      </w:r>
-      <w:proofErr w:type="spellStart"/>
-      <w:r>
-        <w:rPr>
-          <w:i/>
-          <w:color w:val="747474" w:themeColor="background2" w:themeShade="80"/>
-        </w:rPr>
-        <w:t>Tag</w:t>
-      </w:r>
-      <w:proofErr w:type="spellEnd"/>
-      <w:r>
-        <w:rPr>
-          <w:i/>
-          <w:color w:val="747474" w:themeColor="background2" w:themeShade="80"/>
-        </w:rPr>
-        <w:t>` e `@</w:t>
-      </w:r>
-      <w:proofErr w:type="spellStart"/>
-      <w:r>
-        <w:rPr>
-          <w:i/>
-          <w:color w:val="747474" w:themeColor="background2" w:themeShade="80"/>
-        </w:rPr>
-        <w:t>Operation</w:t>
-      </w:r>
-      <w:proofErr w:type="spellEnd"/>
-      <w:r>
-        <w:rPr>
-          <w:i/>
-          <w:color w:val="747474" w:themeColor="background2" w:themeShade="80"/>
-        </w:rPr>
-        <w:t>`, por exemplo em `AlunoController.java`, `CursoController.java`, `ProfessorController.java`, `MatriculaController.java`, `UsuarioController.java` e `AuthController.java`. `SecurityConfig.java` libera `/</w:t>
-      </w:r>
-      <w:proofErr w:type="spellStart"/>
-      <w:r>
-        <w:rPr>
-          <w:i/>
-          <w:color w:val="747474" w:themeColor="background2" w:themeShade="80"/>
-        </w:rPr>
-        <w:t>swagger</w:t>
-      </w:r>
-      <w:proofErr w:type="spellEnd"/>
-      <w:r>
-        <w:rPr>
-          <w:i/>
-          <w:color w:val="747474" w:themeColor="background2" w:themeShade="80"/>
-        </w:rPr>
-        <w:t>-ui/**`, `/swagger-ui.html` e `/v3/</w:t>
-      </w:r>
-      <w:proofErr w:type="spellStart"/>
-      <w:r>
-        <w:rPr>
-          <w:i/>
-          <w:color w:val="747474" w:themeColor="background2" w:themeShade="80"/>
-        </w:rPr>
-        <w:t>api-docs</w:t>
-      </w:r>
-      <w:proofErr w:type="spellEnd"/>
-      <w:r>
-        <w:rPr>
-          <w:i/>
-          <w:color w:val="747474" w:themeColor="background2" w:themeShade="80"/>
-        </w:rPr>
-        <w:t>/**`.</w:t>
-      </w:r>
-    </w:p>
-    <w:p>
-      <w:pPr>
-        <w:pStyle w:val="PargrafodaLista"/>
-      </w:pPr>
+      </w:pPr>
+      <w:r>
+        <w:drawing>
+          <wp:inline distT="0" distB="0" distL="0" distR="0" wp14:anchorId="1F2C055F" wp14:editId="580CA139">
+            <wp:extent cx="1366700" cy="2152650"/>
+            <wp:effectExtent l="0" t="0" r="5080" b="0"/>
+            <wp:docPr id="11" name="Imagem 11"/>
+            <wp:cNvGraphicFramePr>
+              <a:graphicFrameLocks xmlns:a="http://schemas.openxmlformats.org/drawingml/2006/main" noChangeAspect="1"/>
+            </wp:cNvGraphicFramePr>
+            <a:graphic xmlns:a="http://schemas.openxmlformats.org/drawingml/2006/main">
+              <a:graphicData uri="http://schemas.openxmlformats.org/drawingml/2006/picture">
+                <pic:pic xmlns:pic="http://schemas.openxmlformats.org/drawingml/2006/picture">
+                  <pic:nvPicPr>
+                    <pic:cNvPr id="1" name=""/>
+                    <pic:cNvPicPr/>
+                  </pic:nvPicPr>
+                  <pic:blipFill>
+                    <a:blip r:embed="rId15"/>
+                    <a:stretch>
+                      <a:fillRect/>
+                    </a:stretch>
+                  </pic:blipFill>
+                  <pic:spPr>
+                    <a:xfrm>
+                      <a:off x="0" y="0"/>
+                      <a:ext cx="1374655" cy="2165180"/>
+                    </a:xfrm>
+                    <a:prstGeom prst="rect">
+                      <a:avLst/>
+                    </a:prstGeom>
+                  </pic:spPr>
+                </pic:pic>
+              </a:graphicData>
+            </a:graphic>
+          </wp:inline>
+        </w:drawing>
+      </w:r>
     </w:p>
     <w:p>
       <w:pPr>
@@ -3217,51 +3484,23 @@
         </w:numPr>
       </w:pPr>
       <w:r>
-        <w:t xml:space="preserve">Cada integrante da equipe DEVERÁ desenvolver </w:t>
-      </w:r>
-      <w:r>
-        <w:t xml:space="preserve">no mínimo </w:t>
-      </w:r>
-      <w:proofErr w:type="spellStart"/>
-      <w:r>
-        <w:t>endpoints</w:t>
-      </w:r>
-      <w:proofErr w:type="spellEnd"/>
-      <w:r>
-        <w:t xml:space="preserve"> (</w:t>
-      </w:r>
-      <w:proofErr w:type="spellStart"/>
-      <w:r>
-        <w:t>get</w:t>
-      </w:r>
-      <w:proofErr w:type="spellEnd"/>
-      <w:r>
-        <w:t xml:space="preserve">, </w:t>
-      </w:r>
-      <w:r>
-        <w:t>post</w:t>
-      </w:r>
-      <w:r>
-        <w:t xml:space="preserve">, </w:t>
-      </w:r>
-      <w:proofErr w:type="spellStart"/>
-      <w:r>
-        <w:t>put</w:t>
-      </w:r>
-      <w:proofErr w:type="spellEnd"/>
-      <w:r>
-        <w:t xml:space="preserve"> e delete</w:t>
-      </w:r>
-      <w:r>
-        <w:t xml:space="preserve">), via camada </w:t>
-      </w:r>
-      <w:proofErr w:type="spellStart"/>
-      <w:r>
-        <w:t>controller</w:t>
-      </w:r>
-      <w:proofErr w:type="spellEnd"/>
-      <w:r>
-        <w:t xml:space="preserve"> e apresentados em URI, via Spring Boot.</w:t>
+        <w:t>Inserir as Configurações no projeto para apresentação da API (</w:t>
+      </w:r>
+      <w:proofErr w:type="spellStart"/>
+      <w:r>
+        <w:t>Application</w:t>
+      </w:r>
+      <w:proofErr w:type="spellEnd"/>
+      <w:r>
+        <w:t xml:space="preserve"> </w:t>
+      </w:r>
+      <w:proofErr w:type="spellStart"/>
+      <w:r>
+        <w:t>Programming</w:t>
+      </w:r>
+      <w:proofErr w:type="spellEnd"/>
+      <w:r>
+        <w:t xml:space="preserve"> Interface) via Swagger.</w:t>
       </w:r>
     </w:p>
     <w:p>
@@ -3277,6 +3516,7 @@
         <w:rPr>
           <w:b/>
         </w:rPr>
+        <w:lastRenderedPageBreak/>
         <w:t>Resposta:</w:t>
       </w:r>
       <w:r>
@@ -3287,37 +3527,115 @@
           <w:i/>
           <w:color w:val="747474" w:themeColor="background2" w:themeShade="80"/>
         </w:rPr>
-        <w:t xml:space="preserve">Os </w:t>
-      </w:r>
-      <w:proofErr w:type="spellStart"/>
-      <w:r>
-        <w:rPr>
-          <w:i/>
-          <w:color w:val="747474" w:themeColor="background2" w:themeShade="80"/>
-        </w:rPr>
-        <w:t>endpoints</w:t>
-      </w:r>
-      <w:proofErr w:type="spellEnd"/>
-      <w:r>
-        <w:rPr>
-          <w:i/>
-          <w:color w:val="747474" w:themeColor="background2" w:themeShade="80"/>
-        </w:rPr>
-        <w:t xml:space="preserve"> CRUD est</w:t>
-      </w:r>
-      <w:r>
-        <w:rPr>
-          <w:i/>
-          <w:color w:val="747474" w:themeColor="background2" w:themeShade="80"/>
-        </w:rPr>
-        <w:t>ã</w:t>
-      </w:r>
-      <w:r>
-        <w:rPr>
-          <w:i/>
-          <w:color w:val="747474" w:themeColor="background2" w:themeShade="80"/>
-        </w:rPr>
-        <w:t xml:space="preserve">o implementados nos </w:t>
+        <w:t>A apresenta</w:t>
+      </w:r>
+      <w:r>
+        <w:rPr>
+          <w:i/>
+          <w:color w:val="747474" w:themeColor="background2" w:themeShade="80"/>
+        </w:rPr>
+        <w:t>çã</w:t>
+      </w:r>
+      <w:r>
+        <w:rPr>
+          <w:i/>
+          <w:color w:val="747474" w:themeColor="background2" w:themeShade="80"/>
+        </w:rPr>
+        <w:t>o da API via Swagger/</w:t>
+      </w:r>
+      <w:proofErr w:type="spellStart"/>
+      <w:r>
+        <w:rPr>
+          <w:i/>
+          <w:color w:val="747474" w:themeColor="background2" w:themeShade="80"/>
+        </w:rPr>
+        <w:t>OpenAPI</w:t>
+      </w:r>
+      <w:proofErr w:type="spellEnd"/>
+      <w:r>
+        <w:rPr>
+          <w:i/>
+          <w:color w:val="747474" w:themeColor="background2" w:themeShade="80"/>
+        </w:rPr>
+        <w:t xml:space="preserve"> est</w:t>
+      </w:r>
+      <w:r>
+        <w:rPr>
+          <w:i/>
+          <w:color w:val="747474" w:themeColor="background2" w:themeShade="80"/>
+        </w:rPr>
+        <w:t>á</w:t>
+      </w:r>
+      <w:r>
+        <w:rPr>
+          <w:i/>
+          <w:color w:val="747474" w:themeColor="background2" w:themeShade="80"/>
+        </w:rPr>
+        <w:t xml:space="preserve"> configurada pela depend</w:t>
+      </w:r>
+      <w:r>
+        <w:rPr>
+          <w:i/>
+          <w:color w:val="747474" w:themeColor="background2" w:themeShade="80"/>
+        </w:rPr>
+        <w:t>ê</w:t>
+      </w:r>
+      <w:r>
+        <w:rPr>
+          <w:i/>
+          <w:color w:val="747474" w:themeColor="background2" w:themeShade="80"/>
+        </w:rPr>
+        <w:t>ncia `</w:t>
+      </w:r>
+      <w:proofErr w:type="gramStart"/>
+      <w:r>
+        <w:rPr>
+          <w:i/>
+          <w:color w:val="747474" w:themeColor="background2" w:themeShade="80"/>
+        </w:rPr>
+        <w:t>org.springdoc</w:t>
+      </w:r>
+      <w:proofErr w:type="gramEnd"/>
+      <w:r>
+        <w:rPr>
+          <w:i/>
+          <w:color w:val="747474" w:themeColor="background2" w:themeShade="80"/>
+        </w:rPr>
+        <w:t>:springdoc-openapi-starter-webmvc-ui:2.6.0` no `pom.xml`. Em `</w:t>
+      </w:r>
+      <w:proofErr w:type="spellStart"/>
+      <w:proofErr w:type="gramStart"/>
+      <w:r>
+        <w:rPr>
+          <w:i/>
+          <w:color w:val="747474" w:themeColor="background2" w:themeShade="80"/>
+        </w:rPr>
+        <w:t>application.properties</w:t>
+      </w:r>
+      <w:proofErr w:type="spellEnd"/>
+      <w:proofErr w:type="gramEnd"/>
+      <w:r>
+        <w:rPr>
+          <w:i/>
+          <w:color w:val="747474" w:themeColor="background2" w:themeShade="80"/>
+        </w:rPr>
+        <w:t>`, a propriedade `</w:t>
+      </w:r>
+      <w:proofErr w:type="spellStart"/>
+      <w:r>
+        <w:rPr>
+          <w:i/>
+          <w:color w:val="747474" w:themeColor="background2" w:themeShade="80"/>
+        </w:rPr>
+        <w:t>springdoc.swagger-ui.path</w:t>
+      </w:r>
+      <w:proofErr w:type="spellEnd"/>
+      <w:r>
+        <w:rPr>
+          <w:i/>
+          <w:color w:val="747474" w:themeColor="background2" w:themeShade="80"/>
+        </w:rPr>
+        <w:t xml:space="preserve">=/swagger-ui.html` define o caminho da interface. Os </w:t>
       </w:r>
       <w:proofErr w:type="spellStart"/>
       <w:r>
@@ -3333,127 +3651,152 @@
           <w:i/>
           <w:color w:val="747474" w:themeColor="background2" w:themeShade="80"/>
         </w:rPr>
-        <w:t>. `AlunoController.java` exp</w:t>
-      </w:r>
-      <w:r>
-        <w:rPr>
-          <w:i/>
-          <w:color w:val="747474" w:themeColor="background2" w:themeShade="80"/>
-        </w:rPr>
-        <w:t>õ</w:t>
-      </w:r>
-      <w:r>
-        <w:rPr>
-          <w:i/>
-          <w:color w:val="747474" w:themeColor="background2" w:themeShade="80"/>
-        </w:rPr>
-        <w:t>e `/aluno` com POST criar, GET listar, GET `/{id}` buscar, PUT `/{id}` atualizar e DELETE `/{id}` remover. O mesmo padr</w:t>
-      </w:r>
-      <w:r>
-        <w:rPr>
-          <w:i/>
-          <w:color w:val="747474" w:themeColor="background2" w:themeShade="80"/>
-        </w:rPr>
-        <w:t>ã</w:t>
-      </w:r>
-      <w:r>
-        <w:rPr>
-          <w:i/>
-          <w:color w:val="747474" w:themeColor="background2" w:themeShade="80"/>
-        </w:rPr>
-        <w:t>o aparece em `ProfessorController.java` (`/professor`), `CursoController.java` (`/curso`, incluindo PUT `/{id}/status` e GET `</w:t>
-      </w:r>
-      <w:proofErr w:type="spellStart"/>
-      <w:r>
-        <w:rPr>
-          <w:i/>
-          <w:color w:val="747474" w:themeColor="background2" w:themeShade="80"/>
-        </w:rPr>
-        <w:t>EmAndamento</w:t>
-      </w:r>
-      <w:proofErr w:type="spellEnd"/>
-      <w:r>
-        <w:rPr>
-          <w:i/>
-          <w:color w:val="747474" w:themeColor="background2" w:themeShade="80"/>
-        </w:rPr>
-        <w:t>`), `MatriculaController.java` (`/matricula`) e `UsuarioController.java` (`/</w:t>
-      </w:r>
-      <w:proofErr w:type="spellStart"/>
-      <w:r>
-        <w:rPr>
-          <w:i/>
-          <w:color w:val="747474" w:themeColor="background2" w:themeShade="80"/>
-        </w:rPr>
-        <w:t>usuario</w:t>
-      </w:r>
-      <w:proofErr w:type="spellEnd"/>
-      <w:r>
-        <w:rPr>
-          <w:i/>
-          <w:color w:val="747474" w:themeColor="background2" w:themeShade="80"/>
-        </w:rPr>
-        <w:t>`). `AuthController.java` implementa POST `/login` para autentica</w:t>
-      </w:r>
-      <w:r>
-        <w:rPr>
-          <w:i/>
-          <w:color w:val="747474" w:themeColor="background2" w:themeShade="80"/>
-        </w:rPr>
-        <w:t>çã</w:t>
-      </w:r>
-      <w:r>
-        <w:rPr>
-          <w:i/>
-          <w:color w:val="747474" w:themeColor="background2" w:themeShade="80"/>
-        </w:rPr>
-        <w:t>o. Os m</w:t>
-      </w:r>
-      <w:r>
-        <w:rPr>
-          <w:i/>
-          <w:color w:val="747474" w:themeColor="background2" w:themeShade="80"/>
-        </w:rPr>
-        <w:t>é</w:t>
-      </w:r>
-      <w:r>
-        <w:rPr>
-          <w:i/>
-          <w:color w:val="747474" w:themeColor="background2" w:themeShade="80"/>
-        </w:rPr>
-        <w:t xml:space="preserve">todos chamam os </w:t>
-      </w:r>
-      <w:proofErr w:type="spellStart"/>
-      <w:r>
-        <w:rPr>
-          <w:i/>
-          <w:color w:val="747474" w:themeColor="background2" w:themeShade="80"/>
-        </w:rPr>
-        <w:t>services</w:t>
-      </w:r>
-      <w:proofErr w:type="spellEnd"/>
-      <w:r>
-        <w:rPr>
-          <w:i/>
-          <w:color w:val="747474" w:themeColor="background2" w:themeShade="80"/>
-        </w:rPr>
-        <w:t xml:space="preserve"> correspondentes e retornam </w:t>
-      </w:r>
-      <w:proofErr w:type="spellStart"/>
-      <w:r>
-        <w:rPr>
-          <w:i/>
-          <w:color w:val="747474" w:themeColor="background2" w:themeShade="80"/>
-        </w:rPr>
-        <w:t>DTOs</w:t>
-      </w:r>
-      <w:proofErr w:type="spellEnd"/>
-      <w:r>
-        <w:rPr>
-          <w:i/>
-          <w:color w:val="747474" w:themeColor="background2" w:themeShade="80"/>
-        </w:rPr>
-        <w:t xml:space="preserve"> de resposta.</w:t>
+        <w:t xml:space="preserve"> usam anota</w:t>
+      </w:r>
+      <w:r>
+        <w:rPr>
+          <w:i/>
+          <w:color w:val="747474" w:themeColor="background2" w:themeShade="80"/>
+        </w:rPr>
+        <w:t>çõe</w:t>
+      </w:r>
+      <w:r>
+        <w:rPr>
+          <w:i/>
+          <w:color w:val="747474" w:themeColor="background2" w:themeShade="80"/>
+        </w:rPr>
+        <w:t xml:space="preserve">s </w:t>
+      </w:r>
+      <w:proofErr w:type="spellStart"/>
+      <w:r>
+        <w:rPr>
+          <w:i/>
+          <w:color w:val="747474" w:themeColor="background2" w:themeShade="80"/>
+        </w:rPr>
+        <w:t>OpenAPI</w:t>
+      </w:r>
+      <w:proofErr w:type="spellEnd"/>
+      <w:r>
+        <w:rPr>
+          <w:i/>
+          <w:color w:val="747474" w:themeColor="background2" w:themeShade="80"/>
+        </w:rPr>
+        <w:t>, como `@</w:t>
+      </w:r>
+      <w:proofErr w:type="spellStart"/>
+      <w:r>
+        <w:rPr>
+          <w:i/>
+          <w:color w:val="747474" w:themeColor="background2" w:themeShade="80"/>
+        </w:rPr>
+        <w:t>Tag</w:t>
+      </w:r>
+      <w:proofErr w:type="spellEnd"/>
+      <w:r>
+        <w:rPr>
+          <w:i/>
+          <w:color w:val="747474" w:themeColor="background2" w:themeShade="80"/>
+        </w:rPr>
+        <w:t>` e `@</w:t>
+      </w:r>
+      <w:proofErr w:type="spellStart"/>
+      <w:r>
+        <w:rPr>
+          <w:i/>
+          <w:color w:val="747474" w:themeColor="background2" w:themeShade="80"/>
+        </w:rPr>
+        <w:t>Operation</w:t>
+      </w:r>
+      <w:proofErr w:type="spellEnd"/>
+      <w:r>
+        <w:rPr>
+          <w:i/>
+          <w:color w:val="747474" w:themeColor="background2" w:themeShade="80"/>
+        </w:rPr>
+        <w:t>`, por exemplo em `AlunoController.java`, `CursoController.java`, `ProfessorController.java`, `MatriculaController.java`, `UsuarioController.java` e `AuthController.java`. `SecurityConfig.java` libera `/</w:t>
+      </w:r>
+      <w:proofErr w:type="spellStart"/>
+      <w:r>
+        <w:rPr>
+          <w:i/>
+          <w:color w:val="747474" w:themeColor="background2" w:themeShade="80"/>
+        </w:rPr>
+        <w:t>swagger</w:t>
+      </w:r>
+      <w:proofErr w:type="spellEnd"/>
+      <w:r>
+        <w:rPr>
+          <w:i/>
+          <w:color w:val="747474" w:themeColor="background2" w:themeShade="80"/>
+        </w:rPr>
+        <w:t>-ui/**`, `/swagger-ui.html` e `/v3/</w:t>
+      </w:r>
+      <w:proofErr w:type="spellStart"/>
+      <w:r>
+        <w:rPr>
+          <w:i/>
+          <w:color w:val="747474" w:themeColor="background2" w:themeShade="80"/>
+        </w:rPr>
+        <w:t>api-docs</w:t>
+      </w:r>
+      <w:proofErr w:type="spellEnd"/>
+      <w:r>
+        <w:rPr>
+          <w:i/>
+          <w:color w:val="747474" w:themeColor="background2" w:themeShade="80"/>
+        </w:rPr>
+        <w:t>/**`.</w:t>
+      </w:r>
+    </w:p>
+    <w:p>
+      <w:pPr>
+        <w:pStyle w:val="PargrafodaLista"/>
+        <w:jc w:val="both"/>
+        <w:rPr>
+          <w:i/>
+          <w:color w:val="747474" w:themeColor="background2" w:themeShade="80"/>
+        </w:rPr>
+      </w:pPr>
+      <w:r>
+        <w:rPr>
+          <w:i/>
+          <w:color w:val="747474" w:themeColor="background2" w:themeShade="80"/>
+        </w:rPr>
+        <w:drawing>
+          <wp:inline distT="0" distB="0" distL="0" distR="0" wp14:anchorId="0864E12A" wp14:editId="6E19D89B">
+            <wp:extent cx="3943350" cy="1667484"/>
+            <wp:effectExtent l="0" t="0" r="0" b="9525"/>
+            <wp:docPr id="12" name="Imagem 12"/>
+            <wp:cNvGraphicFramePr>
+              <a:graphicFrameLocks xmlns:a="http://schemas.openxmlformats.org/drawingml/2006/main" noChangeAspect="1"/>
+            </wp:cNvGraphicFramePr>
+            <a:graphic xmlns:a="http://schemas.openxmlformats.org/drawingml/2006/main">
+              <a:graphicData uri="http://schemas.openxmlformats.org/drawingml/2006/picture">
+                <pic:pic xmlns:pic="http://schemas.openxmlformats.org/drawingml/2006/picture">
+                  <pic:nvPicPr>
+                    <pic:cNvPr id="1" name=""/>
+                    <pic:cNvPicPr/>
+                  </pic:nvPicPr>
+                  <pic:blipFill>
+                    <a:blip r:embed="rId16"/>
+                    <a:stretch>
+                      <a:fillRect/>
+                    </a:stretch>
+                  </pic:blipFill>
+                  <pic:spPr>
+                    <a:xfrm>
+                      <a:off x="0" y="0"/>
+                      <a:ext cx="3950080" cy="1670330"/>
+                    </a:xfrm>
+                    <a:prstGeom prst="rect">
+                      <a:avLst/>
+                    </a:prstGeom>
+                  </pic:spPr>
+                </pic:pic>
+              </a:graphicData>
+            </a:graphic>
+          </wp:inline>
+        </w:drawing>
       </w:r>
     </w:p>
     <w:p>
@@ -3470,7 +3813,51 @@
         </w:numPr>
       </w:pPr>
       <w:r>
-        <w:t>A equipe deverá apresentar a aplicação rodando via Spring Boot, mostrando as funcionalidades implementadas na API.</w:t>
+        <w:t xml:space="preserve">Cada integrante da equipe DEVERÁ desenvolver </w:t>
+      </w:r>
+      <w:r>
+        <w:t xml:space="preserve">no mínimo </w:t>
+      </w:r>
+      <w:proofErr w:type="spellStart"/>
+      <w:r>
+        <w:t>endpoints</w:t>
+      </w:r>
+      <w:proofErr w:type="spellEnd"/>
+      <w:r>
+        <w:t xml:space="preserve"> (</w:t>
+      </w:r>
+      <w:proofErr w:type="spellStart"/>
+      <w:r>
+        <w:t>get</w:t>
+      </w:r>
+      <w:proofErr w:type="spellEnd"/>
+      <w:r>
+        <w:t xml:space="preserve">, </w:t>
+      </w:r>
+      <w:r>
+        <w:t>post</w:t>
+      </w:r>
+      <w:r>
+        <w:t xml:space="preserve">, </w:t>
+      </w:r>
+      <w:proofErr w:type="spellStart"/>
+      <w:r>
+        <w:t>put</w:t>
+      </w:r>
+      <w:proofErr w:type="spellEnd"/>
+      <w:r>
+        <w:t xml:space="preserve"> e delete</w:t>
+      </w:r>
+      <w:r>
+        <w:t xml:space="preserve">), via camada </w:t>
+      </w:r>
+      <w:proofErr w:type="spellStart"/>
+      <w:r>
+        <w:t>controller</w:t>
+      </w:r>
+      <w:proofErr w:type="spellEnd"/>
+      <w:r>
+        <w:t xml:space="preserve"> e apresentados em URI, via Spring Boot.</w:t>
       </w:r>
     </w:p>
     <w:p>
@@ -3496,7 +3883,113 @@
           <w:i/>
           <w:color w:val="747474" w:themeColor="background2" w:themeShade="80"/>
         </w:rPr>
-        <w:t>A aplica</w:t>
+        <w:t xml:space="preserve">Os </w:t>
+      </w:r>
+      <w:proofErr w:type="spellStart"/>
+      <w:r>
+        <w:rPr>
+          <w:i/>
+          <w:color w:val="747474" w:themeColor="background2" w:themeShade="80"/>
+        </w:rPr>
+        <w:t>endpoints</w:t>
+      </w:r>
+      <w:proofErr w:type="spellEnd"/>
+      <w:r>
+        <w:rPr>
+          <w:i/>
+          <w:color w:val="747474" w:themeColor="background2" w:themeShade="80"/>
+        </w:rPr>
+        <w:t xml:space="preserve"> CRUD est</w:t>
+      </w:r>
+      <w:r>
+        <w:rPr>
+          <w:i/>
+          <w:color w:val="747474" w:themeColor="background2" w:themeShade="80"/>
+        </w:rPr>
+        <w:t>ã</w:t>
+      </w:r>
+      <w:r>
+        <w:rPr>
+          <w:i/>
+          <w:color w:val="747474" w:themeColor="background2" w:themeShade="80"/>
+        </w:rPr>
+        <w:t xml:space="preserve">o implementados nos </w:t>
+      </w:r>
+      <w:proofErr w:type="spellStart"/>
+      <w:r>
+        <w:rPr>
+          <w:i/>
+          <w:color w:val="747474" w:themeColor="background2" w:themeShade="80"/>
+        </w:rPr>
+        <w:t>controllers</w:t>
+      </w:r>
+      <w:proofErr w:type="spellEnd"/>
+      <w:r>
+        <w:rPr>
+          <w:i/>
+          <w:color w:val="747474" w:themeColor="background2" w:themeShade="80"/>
+        </w:rPr>
+        <w:t>. `AlunoController.java` exp</w:t>
+      </w:r>
+      <w:r>
+        <w:rPr>
+          <w:i/>
+          <w:color w:val="747474" w:themeColor="background2" w:themeShade="80"/>
+        </w:rPr>
+        <w:t>õ</w:t>
+      </w:r>
+      <w:r>
+        <w:rPr>
+          <w:i/>
+          <w:color w:val="747474" w:themeColor="background2" w:themeShade="80"/>
+        </w:rPr>
+        <w:t>e `/aluno` com POST criar, GET listar, GET `/{id}` buscar, PUT `/{id}` atualizar e DELETE `/{id}` remover. O mesmo padr</w:t>
+      </w:r>
+      <w:r>
+        <w:rPr>
+          <w:i/>
+          <w:color w:val="747474" w:themeColor="background2" w:themeShade="80"/>
+        </w:rPr>
+        <w:t>ã</w:t>
+      </w:r>
+      <w:r>
+        <w:rPr>
+          <w:i/>
+          <w:color w:val="747474" w:themeColor="background2" w:themeShade="80"/>
+        </w:rPr>
+        <w:t>o aparece em `ProfessorController.java` (`/professor`), `CursoController.java` (`/curso`, incluindo PUT `/{id}/status` e GET `</w:t>
+      </w:r>
+      <w:proofErr w:type="spellStart"/>
+      <w:r>
+        <w:rPr>
+          <w:i/>
+          <w:color w:val="747474" w:themeColor="background2" w:themeShade="80"/>
+        </w:rPr>
+        <w:t>EmAndamento</w:t>
+      </w:r>
+      <w:proofErr w:type="spellEnd"/>
+      <w:r>
+        <w:rPr>
+          <w:i/>
+          <w:color w:val="747474" w:themeColor="background2" w:themeShade="80"/>
+        </w:rPr>
+        <w:t>`), `MatriculaController.java` (`/matricula`) e `UsuarioController.java` (`/</w:t>
+      </w:r>
+      <w:proofErr w:type="spellStart"/>
+      <w:r>
+        <w:rPr>
+          <w:i/>
+          <w:color w:val="747474" w:themeColor="background2" w:themeShade="80"/>
+        </w:rPr>
+        <w:t>usuario</w:t>
+      </w:r>
+      <w:proofErr w:type="spellEnd"/>
+      <w:r>
+        <w:rPr>
+          <w:i/>
+          <w:color w:val="747474" w:themeColor="background2" w:themeShade="80"/>
+        </w:rPr>
+        <w:t>`). `AuthController.java` implementa POST `/login` para autentica</w:t>
       </w:r>
       <w:r>
         <w:rPr>
@@ -3510,117 +4003,21 @@
           <w:i/>
           <w:color w:val="747474" w:themeColor="background2" w:themeShade="80"/>
         </w:rPr>
-        <w:t>o roda via Spring Boot pela classe `SandraXAndreiaApplication.java`, que executa `</w:t>
-      </w:r>
-      <w:proofErr w:type="spellStart"/>
-      <w:r>
-        <w:rPr>
-          <w:i/>
-          <w:color w:val="747474" w:themeColor="background2" w:themeShade="80"/>
-        </w:rPr>
-        <w:t>SpringApplication.run</w:t>
-      </w:r>
-      <w:proofErr w:type="spellEnd"/>
-      <w:r>
-        <w:rPr>
-          <w:i/>
-          <w:color w:val="747474" w:themeColor="background2" w:themeShade="80"/>
-        </w:rPr>
-        <w:t>(...)`. O `pom.xml` inclui o plugin `</w:t>
-      </w:r>
-      <w:proofErr w:type="spellStart"/>
-      <w:r>
-        <w:rPr>
-          <w:i/>
-          <w:color w:val="747474" w:themeColor="background2" w:themeShade="80"/>
-        </w:rPr>
-        <w:t>spring</w:t>
-      </w:r>
-      <w:proofErr w:type="spellEnd"/>
-      <w:r>
-        <w:rPr>
-          <w:i/>
-          <w:color w:val="747474" w:themeColor="background2" w:themeShade="80"/>
-        </w:rPr>
-        <w:t>-boot-</w:t>
-      </w:r>
-      <w:proofErr w:type="spellStart"/>
-      <w:r>
-        <w:rPr>
-          <w:i/>
-          <w:color w:val="747474" w:themeColor="background2" w:themeShade="80"/>
-        </w:rPr>
-        <w:t>maven</w:t>
-      </w:r>
-      <w:proofErr w:type="spellEnd"/>
-      <w:r>
-        <w:rPr>
-          <w:i/>
-          <w:color w:val="747474" w:themeColor="background2" w:themeShade="80"/>
-        </w:rPr>
-        <w:t xml:space="preserve">-plugin`, permitindo executar e empacotar a API com </w:t>
-      </w:r>
-      <w:proofErr w:type="spellStart"/>
-      <w:r>
-        <w:rPr>
-          <w:i/>
-          <w:color w:val="747474" w:themeColor="background2" w:themeShade="80"/>
-        </w:rPr>
-        <w:t>Maven</w:t>
-      </w:r>
-      <w:proofErr w:type="spellEnd"/>
-      <w:r>
-        <w:rPr>
-          <w:i/>
-          <w:color w:val="747474" w:themeColor="background2" w:themeShade="80"/>
-        </w:rPr>
-        <w:t>. As funcionalidades implementadas ficam dispon</w:t>
-      </w:r>
-      <w:r>
-        <w:rPr>
-          <w:i/>
-          <w:color w:val="747474" w:themeColor="background2" w:themeShade="80"/>
-        </w:rPr>
-        <w:t>í</w:t>
-      </w:r>
-      <w:r>
-        <w:rPr>
-          <w:i/>
-          <w:color w:val="747474" w:themeColor="background2" w:themeShade="80"/>
-        </w:rPr>
-        <w:t xml:space="preserve">veis nos </w:t>
-      </w:r>
-      <w:proofErr w:type="spellStart"/>
-      <w:r>
-        <w:rPr>
-          <w:i/>
-          <w:color w:val="747474" w:themeColor="background2" w:themeShade="80"/>
-        </w:rPr>
-        <w:t>controllers</w:t>
-      </w:r>
-      <w:proofErr w:type="spellEnd"/>
-      <w:r>
-        <w:rPr>
-          <w:i/>
-          <w:color w:val="747474" w:themeColor="background2" w:themeShade="80"/>
-        </w:rPr>
-        <w:t xml:space="preserve"> REST em `/aluno`, `/professor`, `/curso`, `/matricula`, `/</w:t>
-      </w:r>
-      <w:proofErr w:type="spellStart"/>
-      <w:r>
-        <w:rPr>
-          <w:i/>
-          <w:color w:val="747474" w:themeColor="background2" w:themeShade="80"/>
-        </w:rPr>
-        <w:t>usuario</w:t>
-      </w:r>
-      <w:proofErr w:type="spellEnd"/>
-      <w:r>
-        <w:rPr>
-          <w:i/>
-          <w:color w:val="747474" w:themeColor="background2" w:themeShade="80"/>
-        </w:rPr>
-        <w:t xml:space="preserve">` e `/login`, usando os </w:t>
+        <w:t>o. Os m</w:t>
+      </w:r>
+      <w:r>
+        <w:rPr>
+          <w:i/>
+          <w:color w:val="747474" w:themeColor="background2" w:themeShade="80"/>
+        </w:rPr>
+        <w:t>é</w:t>
+      </w:r>
+      <w:r>
+        <w:rPr>
+          <w:i/>
+          <w:color w:val="747474" w:themeColor="background2" w:themeShade="80"/>
+        </w:rPr>
+        <w:t xml:space="preserve">todos chamam os </w:t>
       </w:r>
       <w:proofErr w:type="spellStart"/>
       <w:r>
@@ -3636,85 +4033,136 @@
           <w:i/>
           <w:color w:val="747474" w:themeColor="background2" w:themeShade="80"/>
         </w:rPr>
-        <w:t xml:space="preserve"> e </w:t>
-      </w:r>
-      <w:proofErr w:type="spellStart"/>
-      <w:r>
-        <w:rPr>
-          <w:i/>
-          <w:color w:val="747474" w:themeColor="background2" w:themeShade="80"/>
-        </w:rPr>
-        <w:t>repositories</w:t>
-      </w:r>
-      <w:proofErr w:type="spellEnd"/>
-      <w:r>
-        <w:rPr>
-          <w:i/>
-          <w:color w:val="747474" w:themeColor="background2" w:themeShade="80"/>
-        </w:rPr>
-        <w:t xml:space="preserve"> do projeto. A configura</w:t>
-      </w:r>
-      <w:r>
-        <w:rPr>
-          <w:i/>
-          <w:color w:val="747474" w:themeColor="background2" w:themeShade="80"/>
-        </w:rPr>
-        <w:t>çã</w:t>
-      </w:r>
-      <w:r>
-        <w:rPr>
-          <w:i/>
-          <w:color w:val="747474" w:themeColor="background2" w:themeShade="80"/>
-        </w:rPr>
-        <w:t>o ativa o perfil `</w:t>
-      </w:r>
-      <w:proofErr w:type="spellStart"/>
-      <w:r>
-        <w:rPr>
-          <w:i/>
-          <w:color w:val="747474" w:themeColor="background2" w:themeShade="80"/>
-        </w:rPr>
-        <w:t>postgres</w:t>
-      </w:r>
-      <w:proofErr w:type="spellEnd"/>
-      <w:r>
-        <w:rPr>
-          <w:i/>
-          <w:color w:val="747474" w:themeColor="background2" w:themeShade="80"/>
-        </w:rPr>
-        <w:t>` por padr</w:t>
-      </w:r>
-      <w:r>
-        <w:rPr>
-          <w:i/>
-          <w:color w:val="747474" w:themeColor="background2" w:themeShade="80"/>
-        </w:rPr>
-        <w:t>ã</w:t>
-      </w:r>
-      <w:r>
-        <w:rPr>
-          <w:i/>
-          <w:color w:val="747474" w:themeColor="background2" w:themeShade="80"/>
-        </w:rPr>
-        <w:t>o em `</w:t>
-      </w:r>
-      <w:proofErr w:type="spellStart"/>
-      <w:proofErr w:type="gramStart"/>
-      <w:r>
-        <w:rPr>
-          <w:i/>
-          <w:color w:val="747474" w:themeColor="background2" w:themeShade="80"/>
-        </w:rPr>
-        <w:t>application.properties</w:t>
-      </w:r>
-      <w:proofErr w:type="spellEnd"/>
-      <w:proofErr w:type="gramEnd"/>
-      <w:r>
-        <w:rPr>
-          <w:i/>
-          <w:color w:val="747474" w:themeColor="background2" w:themeShade="80"/>
-        </w:rPr>
-        <w:t>`, com alternativa H2 em `application-h2.properties`.</w:t>
+        <w:t xml:space="preserve"> correspondentes e retornam </w:t>
+      </w:r>
+      <w:proofErr w:type="spellStart"/>
+      <w:r>
+        <w:rPr>
+          <w:i/>
+          <w:color w:val="747474" w:themeColor="background2" w:themeShade="80"/>
+        </w:rPr>
+        <w:t>DTOs</w:t>
+      </w:r>
+      <w:proofErr w:type="spellEnd"/>
+      <w:r>
+        <w:rPr>
+          <w:i/>
+          <w:color w:val="747474" w:themeColor="background2" w:themeShade="80"/>
+        </w:rPr>
+        <w:t xml:space="preserve"> de resposta.</w:t>
+      </w:r>
+    </w:p>
+    <w:p>
+      <w:pPr>
+        <w:pStyle w:val="PargrafodaLista"/>
+        <w:jc w:val="both"/>
+        <w:rPr>
+          <w:i/>
+          <w:color w:val="747474" w:themeColor="background2" w:themeShade="80"/>
+        </w:rPr>
+      </w:pPr>
+    </w:p>
+    <w:p>
+      <w:pPr>
+        <w:pStyle w:val="PargrafodaLista"/>
+        <w:jc w:val="both"/>
+        <w:rPr>
+          <w:i/>
+          <w:color w:val="747474" w:themeColor="background2" w:themeShade="80"/>
+        </w:rPr>
+      </w:pPr>
+      <w:r>
+        <w:rPr>
+          <w:i/>
+          <w:color w:val="747474" w:themeColor="background2" w:themeShade="80"/>
+        </w:rPr>
+        <w:drawing>
+          <wp:inline distT="0" distB="0" distL="0" distR="0" wp14:anchorId="1355100E" wp14:editId="41559897">
+            <wp:extent cx="2924583" cy="2819794"/>
+            <wp:effectExtent l="0" t="0" r="0" b="0"/>
+            <wp:docPr id="13" name="Imagem 13"/>
+            <wp:cNvGraphicFramePr>
+              <a:graphicFrameLocks xmlns:a="http://schemas.openxmlformats.org/drawingml/2006/main" noChangeAspect="1"/>
+            </wp:cNvGraphicFramePr>
+            <a:graphic xmlns:a="http://schemas.openxmlformats.org/drawingml/2006/main">
+              <a:graphicData uri="http://schemas.openxmlformats.org/drawingml/2006/picture">
+                <pic:pic xmlns:pic="http://schemas.openxmlformats.org/drawingml/2006/picture">
+                  <pic:nvPicPr>
+                    <pic:cNvPr id="1" name=""/>
+                    <pic:cNvPicPr/>
+                  </pic:nvPicPr>
+                  <pic:blipFill>
+                    <a:blip r:embed="rId17"/>
+                    <a:stretch>
+                      <a:fillRect/>
+                    </a:stretch>
+                  </pic:blipFill>
+                  <pic:spPr>
+                    <a:xfrm>
+                      <a:off x="0" y="0"/>
+                      <a:ext cx="2924583" cy="2819794"/>
+                    </a:xfrm>
+                    <a:prstGeom prst="rect">
+                      <a:avLst/>
+                    </a:prstGeom>
+                  </pic:spPr>
+                </pic:pic>
+              </a:graphicData>
+            </a:graphic>
+          </wp:inline>
+        </w:drawing>
+      </w:r>
+    </w:p>
+    <w:p>
+      <w:pPr>
+        <w:pStyle w:val="PargrafodaLista"/>
+        <w:jc w:val="both"/>
+        <w:rPr>
+          <w:i/>
+          <w:color w:val="747474" w:themeColor="background2" w:themeShade="80"/>
+        </w:rPr>
+      </w:pPr>
+      <w:r>
+        <w:rPr>
+          <w:i/>
+          <w:color w:val="747474" w:themeColor="background2" w:themeShade="80"/>
+        </w:rPr>
+        <w:lastRenderedPageBreak/>
+        <w:drawing>
+          <wp:inline distT="0" distB="0" distL="0" distR="0" wp14:anchorId="72CEB2AC" wp14:editId="592AD9BD">
+            <wp:extent cx="4197350" cy="898798"/>
+            <wp:effectExtent l="0" t="0" r="0" b="0"/>
+            <wp:docPr id="14" name="Imagem 14"/>
+            <wp:cNvGraphicFramePr>
+              <a:graphicFrameLocks xmlns:a="http://schemas.openxmlformats.org/drawingml/2006/main" noChangeAspect="1"/>
+            </wp:cNvGraphicFramePr>
+            <a:graphic xmlns:a="http://schemas.openxmlformats.org/drawingml/2006/main">
+              <a:graphicData uri="http://schemas.openxmlformats.org/drawingml/2006/picture">
+                <pic:pic xmlns:pic="http://schemas.openxmlformats.org/drawingml/2006/picture">
+                  <pic:nvPicPr>
+                    <pic:cNvPr id="1" name=""/>
+                    <pic:cNvPicPr/>
+                  </pic:nvPicPr>
+                  <pic:blipFill>
+                    <a:blip r:embed="rId18"/>
+                    <a:stretch>
+                      <a:fillRect/>
+                    </a:stretch>
+                  </pic:blipFill>
+                  <pic:spPr>
+                    <a:xfrm>
+                      <a:off x="0" y="0"/>
+                      <a:ext cx="4290329" cy="918708"/>
+                    </a:xfrm>
+                    <a:prstGeom prst="rect">
+                      <a:avLst/>
+                    </a:prstGeom>
+                  </pic:spPr>
+                </pic:pic>
+              </a:graphicData>
+            </a:graphic>
+          </wp:inline>
+        </w:drawing>
       </w:r>
     </w:p>
     <w:p>
@@ -3731,7 +4179,7 @@
         </w:numPr>
       </w:pPr>
       <w:r>
-        <w:t>A equipe deverá apresentar a aplicação (API) funcionando via Docker.</w:t>
+        <w:t>A equipe deverá apresentar a aplicação rodando via Spring Boot, mostrando as funcionalidades implementadas na API.</w:t>
       </w:r>
     </w:p>
     <w:p>
@@ -3757,6 +4205,277 @@
           <w:i/>
           <w:color w:val="747474" w:themeColor="background2" w:themeShade="80"/>
         </w:rPr>
+        <w:t>A aplica</w:t>
+      </w:r>
+      <w:r>
+        <w:rPr>
+          <w:i/>
+          <w:color w:val="747474" w:themeColor="background2" w:themeShade="80"/>
+        </w:rPr>
+        <w:t>çã</w:t>
+      </w:r>
+      <w:r>
+        <w:rPr>
+          <w:i/>
+          <w:color w:val="747474" w:themeColor="background2" w:themeShade="80"/>
+        </w:rPr>
+        <w:t>o roda via Spring Boot pela classe `SandraXAndreiaApplication.java`, que executa `</w:t>
+      </w:r>
+      <w:proofErr w:type="spellStart"/>
+      <w:r>
+        <w:rPr>
+          <w:i/>
+          <w:color w:val="747474" w:themeColor="background2" w:themeShade="80"/>
+        </w:rPr>
+        <w:t>SpringApplication.run</w:t>
+      </w:r>
+      <w:proofErr w:type="spellEnd"/>
+      <w:r>
+        <w:rPr>
+          <w:i/>
+          <w:color w:val="747474" w:themeColor="background2" w:themeShade="80"/>
+        </w:rPr>
+        <w:t>(...)`. O `pom.xml` inclui o plugin `</w:t>
+      </w:r>
+      <w:proofErr w:type="spellStart"/>
+      <w:r>
+        <w:rPr>
+          <w:i/>
+          <w:color w:val="747474" w:themeColor="background2" w:themeShade="80"/>
+        </w:rPr>
+        <w:t>spring</w:t>
+      </w:r>
+      <w:proofErr w:type="spellEnd"/>
+      <w:r>
+        <w:rPr>
+          <w:i/>
+          <w:color w:val="747474" w:themeColor="background2" w:themeShade="80"/>
+        </w:rPr>
+        <w:t>-boot-</w:t>
+      </w:r>
+      <w:proofErr w:type="spellStart"/>
+      <w:r>
+        <w:rPr>
+          <w:i/>
+          <w:color w:val="747474" w:themeColor="background2" w:themeShade="80"/>
+        </w:rPr>
+        <w:t>maven</w:t>
+      </w:r>
+      <w:proofErr w:type="spellEnd"/>
+      <w:r>
+        <w:rPr>
+          <w:i/>
+          <w:color w:val="747474" w:themeColor="background2" w:themeShade="80"/>
+        </w:rPr>
+        <w:t xml:space="preserve">-plugin`, permitindo executar e empacotar a API com </w:t>
+      </w:r>
+      <w:proofErr w:type="spellStart"/>
+      <w:r>
+        <w:rPr>
+          <w:i/>
+          <w:color w:val="747474" w:themeColor="background2" w:themeShade="80"/>
+        </w:rPr>
+        <w:t>Maven</w:t>
+      </w:r>
+      <w:proofErr w:type="spellEnd"/>
+      <w:r>
+        <w:rPr>
+          <w:i/>
+          <w:color w:val="747474" w:themeColor="background2" w:themeShade="80"/>
+        </w:rPr>
+        <w:t>. As funcionalidades implementadas ficam dispon</w:t>
+      </w:r>
+      <w:r>
+        <w:rPr>
+          <w:i/>
+          <w:color w:val="747474" w:themeColor="background2" w:themeShade="80"/>
+        </w:rPr>
+        <w:t>í</w:t>
+      </w:r>
+      <w:r>
+        <w:rPr>
+          <w:i/>
+          <w:color w:val="747474" w:themeColor="background2" w:themeShade="80"/>
+        </w:rPr>
+        <w:t xml:space="preserve">veis nos </w:t>
+      </w:r>
+      <w:proofErr w:type="spellStart"/>
+      <w:r>
+        <w:rPr>
+          <w:i/>
+          <w:color w:val="747474" w:themeColor="background2" w:themeShade="80"/>
+        </w:rPr>
+        <w:t>controllers</w:t>
+      </w:r>
+      <w:proofErr w:type="spellEnd"/>
+      <w:r>
+        <w:rPr>
+          <w:i/>
+          <w:color w:val="747474" w:themeColor="background2" w:themeShade="80"/>
+        </w:rPr>
+        <w:t xml:space="preserve"> REST em `/aluno`, `/professor`, `/curso`, `/matricula`, `/</w:t>
+      </w:r>
+      <w:proofErr w:type="spellStart"/>
+      <w:r>
+        <w:rPr>
+          <w:i/>
+          <w:color w:val="747474" w:themeColor="background2" w:themeShade="80"/>
+        </w:rPr>
+        <w:t>usuario</w:t>
+      </w:r>
+      <w:proofErr w:type="spellEnd"/>
+      <w:r>
+        <w:rPr>
+          <w:i/>
+          <w:color w:val="747474" w:themeColor="background2" w:themeShade="80"/>
+        </w:rPr>
+        <w:t xml:space="preserve">` e `/login`, usando os </w:t>
+      </w:r>
+      <w:proofErr w:type="spellStart"/>
+      <w:r>
+        <w:rPr>
+          <w:i/>
+          <w:color w:val="747474" w:themeColor="background2" w:themeShade="80"/>
+        </w:rPr>
+        <w:t>services</w:t>
+      </w:r>
+      <w:proofErr w:type="spellEnd"/>
+      <w:r>
+        <w:rPr>
+          <w:i/>
+          <w:color w:val="747474" w:themeColor="background2" w:themeShade="80"/>
+        </w:rPr>
+        <w:t xml:space="preserve"> e </w:t>
+      </w:r>
+      <w:proofErr w:type="spellStart"/>
+      <w:r>
+        <w:rPr>
+          <w:i/>
+          <w:color w:val="747474" w:themeColor="background2" w:themeShade="80"/>
+        </w:rPr>
+        <w:t>repositories</w:t>
+      </w:r>
+      <w:proofErr w:type="spellEnd"/>
+      <w:r>
+        <w:rPr>
+          <w:i/>
+          <w:color w:val="747474" w:themeColor="background2" w:themeShade="80"/>
+        </w:rPr>
+        <w:t xml:space="preserve"> do projeto. A configura</w:t>
+      </w:r>
+      <w:r>
+        <w:rPr>
+          <w:i/>
+          <w:color w:val="747474" w:themeColor="background2" w:themeShade="80"/>
+        </w:rPr>
+        <w:t>çã</w:t>
+      </w:r>
+      <w:r>
+        <w:rPr>
+          <w:i/>
+          <w:color w:val="747474" w:themeColor="background2" w:themeShade="80"/>
+        </w:rPr>
+        <w:t>o ativa o perfil `</w:t>
+      </w:r>
+      <w:proofErr w:type="spellStart"/>
+      <w:r>
+        <w:rPr>
+          <w:i/>
+          <w:color w:val="747474" w:themeColor="background2" w:themeShade="80"/>
+        </w:rPr>
+        <w:t>postgres</w:t>
+      </w:r>
+      <w:proofErr w:type="spellEnd"/>
+      <w:r>
+        <w:rPr>
+          <w:i/>
+          <w:color w:val="747474" w:themeColor="background2" w:themeShade="80"/>
+        </w:rPr>
+        <w:t>` por padr</w:t>
+      </w:r>
+      <w:r>
+        <w:rPr>
+          <w:i/>
+          <w:color w:val="747474" w:themeColor="background2" w:themeShade="80"/>
+        </w:rPr>
+        <w:t>ã</w:t>
+      </w:r>
+      <w:r>
+        <w:rPr>
+          <w:i/>
+          <w:color w:val="747474" w:themeColor="background2" w:themeShade="80"/>
+        </w:rPr>
+        <w:t>o em `</w:t>
+      </w:r>
+      <w:proofErr w:type="spellStart"/>
+      <w:proofErr w:type="gramStart"/>
+      <w:r>
+        <w:rPr>
+          <w:i/>
+          <w:color w:val="747474" w:themeColor="background2" w:themeShade="80"/>
+        </w:rPr>
+        <w:t>application.properties</w:t>
+      </w:r>
+      <w:proofErr w:type="spellEnd"/>
+      <w:proofErr w:type="gramEnd"/>
+      <w:r>
+        <w:rPr>
+          <w:i/>
+          <w:color w:val="747474" w:themeColor="background2" w:themeShade="80"/>
+        </w:rPr>
+        <w:t>`, com alternativa H2 em `application-h2.properties`.</w:t>
+      </w:r>
+    </w:p>
+    <w:p>
+      <w:pPr>
+        <w:pStyle w:val="PargrafodaLista"/>
+        <w:jc w:val="both"/>
+        <w:rPr>
+          <w:i/>
+          <w:color w:val="747474" w:themeColor="background2" w:themeShade="80"/>
+        </w:rPr>
+      </w:pPr>
+    </w:p>
+    <w:p>
+      <w:pPr>
+        <w:pStyle w:val="PargrafodaLista"/>
+      </w:pPr>
+    </w:p>
+    <w:p>
+      <w:pPr>
+        <w:pStyle w:val="PargrafodaLista"/>
+        <w:numPr>
+          <w:ilvl w:val="0"/>
+          <w:numId w:val="7"/>
+        </w:numPr>
+      </w:pPr>
+      <w:r>
+        <w:t>A equipe deverá apresentar a aplicação (API) funcionando via Docker.</w:t>
+      </w:r>
+    </w:p>
+    <w:p>
+      <w:pPr>
+        <w:pStyle w:val="PargrafodaLista"/>
+        <w:jc w:val="both"/>
+        <w:rPr>
+          <w:i/>
+          <w:color w:val="747474" w:themeColor="background2" w:themeShade="80"/>
+        </w:rPr>
+      </w:pPr>
+      <w:r>
+        <w:rPr>
+          <w:b/>
+        </w:rPr>
+        <w:t>Resposta:</w:t>
+      </w:r>
+      <w:r>
+        <w:t xml:space="preserve"> </w:t>
+      </w:r>
+      <w:r>
+        <w:rPr>
+          <w:i/>
+          <w:color w:val="747474" w:themeColor="background2" w:themeShade="80"/>
+        </w:rPr>
         <w:t>A execu</w:t>
       </w:r>
       <w:r>
@@ -3928,7 +4647,28 @@
         <w:t>`, configura `SPRING_DATASOURCE_URL=jdbc:postgresql://postgres:5432/usuario_db` e publica a API em `8080:8080`.</w:t>
       </w:r>
     </w:p>
-    <w:bookmarkEnd w:id="0"/>
+    <w:p>
+      <w:pPr>
+        <w:pStyle w:val="PargrafodaLista"/>
+        <w:jc w:val="both"/>
+        <w:rPr>
+          <w:i/>
+          <w:color w:val="747474" w:themeColor="background2" w:themeShade="80"/>
+        </w:rPr>
+      </w:pPr>
+      <w:bookmarkStart w:id="0" w:name="_GoBack"/>
+      <w:bookmarkEnd w:id="0"/>
+    </w:p>
+    <w:p>
+      <w:pPr>
+        <w:pStyle w:val="PargrafodaLista"/>
+        <w:jc w:val="both"/>
+        <w:rPr>
+          <w:i/>
+          <w:color w:val="747474" w:themeColor="background2" w:themeShade="80"/>
+        </w:rPr>
+      </w:pPr>
+    </w:p>
     <w:p>
       <w:pPr>
         <w:pStyle w:val="PargrafodaLista"/>
@@ -4048,7 +4788,6 @@
         <w:rPr>
           <w:highlight w:val="yellow"/>
         </w:rPr>
-        <w:lastRenderedPageBreak/>
         <w:t>(0,5): testar a aplicação com possíveis usuários – usuário</w:t>
       </w:r>
       <w:r>
@@ -4144,7 +4883,7 @@
       <w:pPr>
         <w:pStyle w:val="PargrafodaLista"/>
       </w:pPr>
-      <w:hyperlink r:id="rId7" w:history="1">
+      <w:hyperlink r:id="rId19" w:history="1">
         <w:r>
           <w:rPr>
             <w:rStyle w:val="Hyperlink"/>
@@ -4220,6 +4959,7 @@
         </w:numPr>
       </w:pPr>
       <w:r>
+        <w:lastRenderedPageBreak/>
         <w:t>Tarefa</w:t>
       </w:r>
       <w:r>
@@ -4305,7 +5045,7 @@
       </w:pPr>
     </w:p>
     <w:sectPr>
-      <w:headerReference w:type="default" r:id="rId8"/>
+      <w:headerReference w:type="default" r:id="rId20"/>
       <w:pgSz w:w="11906" w:h="16838"/>
       <w:pgMar w:top="1417" w:right="1701" w:bottom="1417" w:left="1701" w:header="708" w:footer="708" w:gutter="0"/>
       <w:cols w:space="708"/>

</xml_diff>